<commit_message>
Đã hoàn thành nội dung nghiên cứu của tuần 1
</commit_message>
<xml_diff>
--- a/PHÂN TÍCH YÊU CẦU ĐỀ-V3.docx
+++ b/PHÂN TÍCH YÊU CẦU ĐỀ-V3.docx
@@ -5778,6 +5778,7 @@
         <w:rPr>
           <w:b/>
           <w:bCs/>
+          <w:noProof/>
         </w:rPr>
         <w:drawing>
           <wp:inline distT="0" distB="0" distL="0" distR="0" wp14:anchorId="1A21D72D" wp14:editId="2568D9D9">
@@ -6026,7 +6027,7 @@
     <w:p>
       <w:r>
         <w:pict w14:anchorId="6CD672AE">
-          <v:rect id="_x0000_i1179" style="width:0;height:1.5pt" o:hralign="center" o:hrstd="t" o:hr="t" fillcolor="#a0a0a0" stroked="f"/>
+          <v:rect id="_x0000_i1027" style="width:0;height:1.5pt" o:hralign="center" o:hrstd="t" o:hr="t" fillcolor="#a0a0a0" stroked="f"/>
         </w:pict>
       </w:r>
     </w:p>
@@ -6193,7 +6194,7 @@
     <w:p>
       <w:r>
         <w:pict w14:anchorId="79FA81C2">
-          <v:rect id="_x0000_i1180" style="width:0;height:1.5pt" o:hralign="center" o:hrstd="t" o:hr="t" fillcolor="#a0a0a0" stroked="f"/>
+          <v:rect id="_x0000_i1028" style="width:0;height:1.5pt" o:hralign="center" o:hrstd="t" o:hr="t" fillcolor="#a0a0a0" stroked="f"/>
         </w:pict>
       </w:r>
     </w:p>
@@ -6328,7 +6329,7 @@
     <w:p>
       <w:r>
         <w:pict w14:anchorId="1A50D5C2">
-          <v:rect id="_x0000_i1181" style="width:0;height:1.5pt" o:hralign="center" o:hrstd="t" o:hr="t" fillcolor="#a0a0a0" stroked="f"/>
+          <v:rect id="_x0000_i1029" style="width:0;height:1.5pt" o:hralign="center" o:hrstd="t" o:hr="t" fillcolor="#a0a0a0" stroked="f"/>
         </w:pict>
       </w:r>
     </w:p>
@@ -6431,7 +6432,7 @@
     <w:p>
       <w:r>
         <w:pict w14:anchorId="2A2524B5">
-          <v:rect id="_x0000_i1182" style="width:0;height:1.5pt" o:hralign="center" o:hrstd="t" o:hr="t" fillcolor="#a0a0a0" stroked="f"/>
+          <v:rect id="_x0000_i1030" style="width:0;height:1.5pt" o:hralign="center" o:hrstd="t" o:hr="t" fillcolor="#a0a0a0" stroked="f"/>
         </w:pict>
       </w:r>
     </w:p>
@@ -6581,7 +6582,7 @@
     <w:p>
       <w:r>
         <w:pict w14:anchorId="6DFDF431">
-          <v:rect id="_x0000_i1183" style="width:0;height:1.5pt" o:hralign="center" o:hrstd="t" o:hr="t" fillcolor="#a0a0a0" stroked="f"/>
+          <v:rect id="_x0000_i1031" style="width:0;height:1.5pt" o:hralign="center" o:hrstd="t" o:hr="t" fillcolor="#a0a0a0" stroked="f"/>
         </w:pict>
       </w:r>
     </w:p>
@@ -6727,7 +6728,7 @@
     <w:p>
       <w:r>
         <w:pict w14:anchorId="428DDDBB">
-          <v:rect id="_x0000_i1184" style="width:0;height:1.5pt" o:hralign="center" o:hrstd="t" o:hr="t" fillcolor="#a0a0a0" stroked="f"/>
+          <v:rect id="_x0000_i1032" style="width:0;height:1.5pt" o:hralign="center" o:hrstd="t" o:hr="t" fillcolor="#a0a0a0" stroked="f"/>
         </w:pict>
       </w:r>
     </w:p>
@@ -6895,7 +6896,7 @@
           <w:noProof/>
         </w:rPr>
         <w:drawing>
-          <wp:inline distT="0" distB="0" distL="0" distR="0" wp14:anchorId="3437C37F" wp14:editId="5F1EC3F2">
+          <wp:inline distT="0" distB="0" distL="0" distR="0" wp14:anchorId="3437C37F" wp14:editId="52EBD171">
             <wp:extent cx="5943600" cy="2661285"/>
             <wp:effectExtent l="0" t="0" r="0" b="5715"/>
             <wp:docPr id="718668885" name="Picture 3"/>
@@ -7781,6 +7782,112 @@
           </wp:inline>
         </w:drawing>
       </w:r>
+    </w:p>
+    <w:p>
+      <w:pPr>
+        <w:rPr>
+          <w:b/>
+          <w:bCs/>
+        </w:rPr>
+      </w:pPr>
+      <w:r>
+        <w:rPr>
+          <w:b/>
+          <w:bCs/>
+        </w:rPr>
+        <w:br w:type="page"/>
+      </w:r>
+    </w:p>
+    <w:p>
+      <w:pPr>
+        <w:ind w:left="720"/>
+        <w:jc w:val="center"/>
+        <w:rPr>
+          <w:b/>
+          <w:bCs/>
+        </w:rPr>
+      </w:pPr>
+      <w:r>
+        <w:rPr>
+          <w:b/>
+          <w:bCs/>
+        </w:rPr>
+        <w:t>KIẾN TRÚC HỆ THỐNG</w:t>
+      </w:r>
+    </w:p>
+    <w:p>
+      <w:pPr>
+        <w:ind w:left="720"/>
+        <w:jc w:val="center"/>
+        <w:rPr>
+          <w:b/>
+          <w:bCs/>
+        </w:rPr>
+      </w:pPr>
+      <w:r>
+        <w:rPr>
+          <w:b/>
+          <w:bCs/>
+        </w:rPr>
+        <w:drawing>
+          <wp:inline distT="0" distB="0" distL="0" distR="0" wp14:anchorId="66B729C5" wp14:editId="6B55BACA">
+            <wp:extent cx="5943600" cy="6910070"/>
+            <wp:effectExtent l="0" t="0" r="0" b="0"/>
+            <wp:docPr id="560835383" name="Picture 2"/>
+            <wp:cNvGraphicFramePr>
+              <a:graphicFrameLocks xmlns:a="http://schemas.openxmlformats.org/drawingml/2006/main" noChangeAspect="1"/>
+            </wp:cNvGraphicFramePr>
+            <a:graphic xmlns:a="http://schemas.openxmlformats.org/drawingml/2006/main">
+              <a:graphicData uri="http://schemas.openxmlformats.org/drawingml/2006/picture">
+                <pic:pic xmlns:pic="http://schemas.openxmlformats.org/drawingml/2006/picture">
+                  <pic:nvPicPr>
+                    <pic:cNvPr id="0" name="Picture 14"/>
+                    <pic:cNvPicPr>
+                      <a:picLocks noChangeAspect="1" noChangeArrowheads="1"/>
+                    </pic:cNvPicPr>
+                  </pic:nvPicPr>
+                  <pic:blipFill>
+                    <a:blip r:embed="rId13" cstate="print">
+                      <a:extLst>
+                        <a:ext uri="{28A0092B-C50C-407E-A947-70E740481C1C}">
+                          <a14:useLocalDpi xmlns:a14="http://schemas.microsoft.com/office/drawing/2010/main" val="0"/>
+                        </a:ext>
+                      </a:extLst>
+                    </a:blip>
+                    <a:srcRect/>
+                    <a:stretch>
+                      <a:fillRect/>
+                    </a:stretch>
+                  </pic:blipFill>
+                  <pic:spPr bwMode="auto">
+                    <a:xfrm>
+                      <a:off x="0" y="0"/>
+                      <a:ext cx="5943600" cy="6910070"/>
+                    </a:xfrm>
+                    <a:prstGeom prst="rect">
+                      <a:avLst/>
+                    </a:prstGeom>
+                    <a:noFill/>
+                    <a:ln>
+                      <a:noFill/>
+                    </a:ln>
+                  </pic:spPr>
+                </pic:pic>
+              </a:graphicData>
+            </a:graphic>
+          </wp:inline>
+        </w:drawing>
+      </w:r>
+    </w:p>
+    <w:p>
+      <w:pPr>
+        <w:ind w:left="720"/>
+        <w:jc w:val="center"/>
+        <w:rPr>
+          <w:b/>
+          <w:bCs/>
+        </w:rPr>
+      </w:pPr>
     </w:p>
     <w:sectPr>
       <w:pgSz w:w="12240" w:h="15840"/>

</xml_diff>